<commit_message>
Add idempotent Supabase migrations for GitHub deploys
Move the schema from sql/001-007 into timestamped supabase/migrations
files that can run on an empty database or one where those scripts
already ran. sql/ now points at that directory so there is one schema.

Co-authored-by: Chainnes <chainnes@users.noreply.github.com>
</commit_message>
<xml_diff>
--- a/docs/CODE_DOCUMENTATION.docx
+++ b/docs/CODE_DOCUMENTATION.docx
@@ -117,10 +117,28 @@
         <w:rPr>
           <w:rFonts w:ascii="Courier New" w:hAnsi="Courier New"/>
         </w:rPr>
-        <w:t>sql/001…007</w:t>
+        <w:t>supabase/migrations/</w:t>
       </w:r>
       <w:r>
-        <w:t>.</w:t>
+        <w:t xml:space="preserve"> (applied on merge to </w:t>
+      </w:r>
+      <w:r>
+        <w:rPr>
+          <w:rFonts w:ascii="Courier New" w:hAnsi="Courier New"/>
+        </w:rPr>
+        <w:t>main</w:t>
+      </w:r>
+      <w:r>
+        <w:t xml:space="preserve">). </w:t>
+      </w:r>
+      <w:r>
+        <w:rPr>
+          <w:rFonts w:ascii="Courier New" w:hAnsi="Courier New"/>
+        </w:rPr>
+        <w:t>sql/</w:t>
+      </w:r>
+      <w:r>
+        <w:t xml:space="preserve"> only points there.</w:t>
       </w:r>
     </w:p>
     <w:p>
@@ -1226,7 +1244,7 @@
               <w:rPr>
                 <w:rFonts w:ascii="Courier New" w:hAnsi="Courier New"/>
               </w:rPr>
-              <w:t>sql/001…007</w:t>
+              <w:t>supabase/migrations/</w:t>
             </w:r>
           </w:p>
         </w:tc>
@@ -1236,13 +1254,13 @@
           </w:tcPr>
           <w:p>
             <w:r>
-              <w:t xml:space="preserve">Database schema, RLS policies, RPC functions. </w:t>
+              <w:t xml:space="preserve">Database schema, RLS policies, RPC functions. Applied by the Supabase GitHub integration. </w:t>
             </w:r>
             <w:r>
               <w:rPr>
                 <w:rFonts w:ascii="Courier New" w:hAnsi="Courier New"/>
               </w:rPr>
-              <w:t>007_ux.sql</w:t>
+              <w:t>20261029105520_ux.sql</w:t>
             </w:r>
             <w:r>
               <w:t xml:space="preserve"> adds </w:t>
@@ -1281,7 +1299,25 @@
               <w:t>request_directory_listing()</w:t>
             </w:r>
             <w:r>
-              <w:t xml:space="preserve"> (insert-only RLS).</w:t>
+              <w:t xml:space="preserve"> (insert-only RLS). </w:t>
+            </w:r>
+            <w:r>
+              <w:rPr>
+                <w:rFonts w:ascii="Courier New" w:hAnsi="Courier New"/>
+              </w:rPr>
+              <w:t>supabase/config.toml</w:t>
+            </w:r>
+            <w:r>
+              <w:t xml:space="preserve"> is local CLI config from </w:t>
+            </w:r>
+            <w:r>
+              <w:rPr>
+                <w:rFonts w:ascii="Courier New" w:hAnsi="Courier New"/>
+              </w:rPr>
+              <w:t>supabase init</w:t>
+            </w:r>
+            <w:r>
+              <w:t xml:space="preserve"> (no keys).</w:t>
             </w:r>
           </w:p>
         </w:tc>

</xml_diff>

<commit_message>
Add idempotent Supabase migrations for GitHub deploys (#2)
Move the schema from sql/001-007 into timestamped supabase/migrations
files that can run on an empty database or one where those scripts
already ran. sql/ now points at that directory so there is one schema.

Co-authored-by: Cursor Agent <cursoragent@cursor.com>
Co-authored-by: Chainnes <chainnes@users.noreply.github.com>
</commit_message>
<xml_diff>
--- a/docs/CODE_DOCUMENTATION.docx
+++ b/docs/CODE_DOCUMENTATION.docx
@@ -117,10 +117,28 @@
         <w:rPr>
           <w:rFonts w:ascii="Courier New" w:hAnsi="Courier New"/>
         </w:rPr>
-        <w:t>sql/001…007</w:t>
+        <w:t>supabase/migrations/</w:t>
       </w:r>
       <w:r>
-        <w:t>.</w:t>
+        <w:t xml:space="preserve"> (applied on merge to </w:t>
+      </w:r>
+      <w:r>
+        <w:rPr>
+          <w:rFonts w:ascii="Courier New" w:hAnsi="Courier New"/>
+        </w:rPr>
+        <w:t>main</w:t>
+      </w:r>
+      <w:r>
+        <w:t xml:space="preserve">). </w:t>
+      </w:r>
+      <w:r>
+        <w:rPr>
+          <w:rFonts w:ascii="Courier New" w:hAnsi="Courier New"/>
+        </w:rPr>
+        <w:t>sql/</w:t>
+      </w:r>
+      <w:r>
+        <w:t xml:space="preserve"> only points there.</w:t>
       </w:r>
     </w:p>
     <w:p>
@@ -1226,7 +1244,7 @@
               <w:rPr>
                 <w:rFonts w:ascii="Courier New" w:hAnsi="Courier New"/>
               </w:rPr>
-              <w:t>sql/001…007</w:t>
+              <w:t>supabase/migrations/</w:t>
             </w:r>
           </w:p>
         </w:tc>
@@ -1236,13 +1254,13 @@
           </w:tcPr>
           <w:p>
             <w:r>
-              <w:t xml:space="preserve">Database schema, RLS policies, RPC functions. </w:t>
+              <w:t xml:space="preserve">Database schema, RLS policies, RPC functions. Applied by the Supabase GitHub integration. </w:t>
             </w:r>
             <w:r>
               <w:rPr>
                 <w:rFonts w:ascii="Courier New" w:hAnsi="Courier New"/>
               </w:rPr>
-              <w:t>007_ux.sql</w:t>
+              <w:t>20261029105520_ux.sql</w:t>
             </w:r>
             <w:r>
               <w:t xml:space="preserve"> adds </w:t>
@@ -1281,7 +1299,25 @@
               <w:t>request_directory_listing()</w:t>
             </w:r>
             <w:r>
-              <w:t xml:space="preserve"> (insert-only RLS).</w:t>
+              <w:t xml:space="preserve"> (insert-only RLS). </w:t>
+            </w:r>
+            <w:r>
+              <w:rPr>
+                <w:rFonts w:ascii="Courier New" w:hAnsi="Courier New"/>
+              </w:rPr>
+              <w:t>supabase/config.toml</w:t>
+            </w:r>
+            <w:r>
+              <w:t xml:space="preserve"> is local CLI config from </w:t>
+            </w:r>
+            <w:r>
+              <w:rPr>
+                <w:rFonts w:ascii="Courier New" w:hAnsi="Courier New"/>
+              </w:rPr>
+              <w:t>supabase init</w:t>
+            </w:r>
+            <w:r>
+              <w:t xml:space="preserve"> (no keys).</w:t>
             </w:r>
           </w:p>
         </w:tc>

</xml_diff>